<commit_message>
feat: update winch reports and spec with peak maximum hoisting speeds
</commit_message>
<xml_diff>
--- a/docs/report/winch_bms/try1/winch_test_analysis_report.docx
+++ b/docs/report/winch_bms/try1/winch_test_analysis_report.docx
@@ -82,7 +82,7 @@
         <w:pStyle w:val="Heading1"/>
       </w:pPr>
       <w:r>
-        <w:t>1. Executive Energy Summary</w:t>
+        <w:t>1. Executive Energy &amp; Speed Summary</w:t>
       </w:r>
     </w:p>
     <w:p>
@@ -162,7 +162,7 @@
         <w:rPr>
           <w:b/>
         </w:rPr>
-        <w:t xml:space="preserve">• 80% SOC Cycle Capacity (Gross, no regen benefit): </w:t>
+        <w:t xml:space="preserve">• 80% SOC Cycle Capacity (Gross): </w:t>
       </w:r>
       <w:r>
         <w:t>280.5 Cycles (lượt lên xuống)</w:t>
@@ -172,13 +172,31 @@
         <w:rPr>
           <w:b/>
         </w:rPr>
-        <w:t xml:space="preserve">• 80% SOC Cycle Capacity (Net, with regen benefit): </w:t>
+        <w:t xml:space="preserve">• 80% SOC Cycle Capacity (Net): </w:t>
+      </w:r>
+      <w:r>
+        <w:t>536.1 Cycles (lượt lên xuống)</w:t>
+        <w:br/>
+        <w:br/>
       </w:r>
       <w:r>
         <w:rPr>
           <w:b/>
         </w:rPr>
-        <w:t>536.1 Cycles (lượt lên xuống)</w:t>
+        <w:t xml:space="preserve">• Maximum Hoisting Speed: </w:t>
+      </w:r>
+      <w:r>
+        <w:t>7.13 m/min (Raise) / 6.43 m/min (Lower)</w:t>
+        <w:br/>
+      </w:r>
+      <w:r>
+        <w:rPr>
+          <w:b/>
+        </w:rPr>
+        <w:t xml:space="preserve">• Average Hoisting Speed (overall stroke): </w:t>
+      </w:r>
+      <w:r>
+        <w:t>5.77 m/min (Raise) / 4.16 m/min (Lower)</w:t>
         <w:br/>
       </w:r>
     </w:p>

</xml_diff>